<commit_message>
I'm adding my analysis of selected companies in my folder
</commit_message>
<xml_diff>
--- a/Analysis/Divya/Snapchat Analysis.docx
+++ b/Analysis/Divya/Snapchat Analysis.docx
@@ -27,9 +27,6 @@
     </w:p>
     <w:p>
       <w:r>
-        <w:br/>
-      </w:r>
-      <w:r>
         <w:rPr>
           <w:b/>
           <w:bCs/>
@@ -42,33 +39,29 @@
       </w:r>
       <w:r>
         <w:br/>
-        <w:t xml:space="preserve">information like name, email, phone number, and username. It also collects content such as </w:t>
-      </w:r>
-      <w:r>
-        <w:br/>
-        <w:t>photos, videos, chats, and stories that users share on the platform.</w:t>
-      </w:r>
-      <w:r>
-        <w:br/>
-        <w:t xml:space="preserve">In addition to this, Snapchat tracks how users interact with the app, including what they </w:t>
-      </w:r>
-      <w:r>
-        <w:br/>
-        <w:t>watch, click on, and how they use features like filters. It also collects location data by</w:t>
-      </w:r>
-      <w:r>
-        <w:br/>
+        <w:t xml:space="preserve">information like name, email, phone number, and username. It also collects content such as photos, videos, chats, and stories that users share on the </w:t>
+      </w:r>
+      <w:proofErr w:type="spellStart"/>
+      <w:proofErr w:type="gramStart"/>
+      <w:r>
+        <w:t>platform.In</w:t>
+      </w:r>
+      <w:proofErr w:type="spellEnd"/>
+      <w:proofErr w:type="gramEnd"/>
+      <w:r>
+        <w:t xml:space="preserve"> addition to this, Snapchat tracks how users interact with the app, including what they watch, click on, and how they use features like filters. It also collects location data by</w:t>
+      </w:r>
+      <w:r>
+        <w:t xml:space="preserve"> </w:t>
+      </w:r>
+      <w:r>
         <w:t xml:space="preserve">using GPS or IP </w:t>
       </w:r>
       <w:r>
         <w:t>addresses</w:t>
       </w:r>
       <w:r>
-        <w:t xml:space="preserve"> and device information such as the type of phone, operating system, </w:t>
-      </w:r>
-      <w:r>
-        <w:br/>
-        <w:t>and other technical details.</w:t>
+        <w:t xml:space="preserve"> and device information such as the type of phone, operating system, and other technical details.</w:t>
       </w:r>
       <w:r>
         <w:br/>
@@ -80,9 +73,6 @@
       </w:r>
     </w:p>
     <w:p>
-      <w:r>
-        <w:br/>
-      </w:r>
       <w:r>
         <w:rPr>
           <w:b/>
@@ -96,15 +86,7 @@
       </w:r>
       <w:r>
         <w:br/>
-        <w:t xml:space="preserve">targeted ads, service providers to help to run the app, and other users depending on privacy </w:t>
-      </w:r>
-      <w:r>
-        <w:br/>
-        <w:t xml:space="preserve">settings. It may also share data with business partners and government authorities when required for legal or security reasons. Advertising plays a big role in Snapchat, so data sharing is an </w:t>
-      </w:r>
-      <w:r>
-        <w:br/>
-        <w:t>important part of its system.</w:t>
+        <w:t>targeted ads, service providers to help to run the app, and other users depending on privacy settings. It may also share data with business partners and government authorities when required for legal or security reasons. Advertising plays a big role in Snapchat, so data sharing is an important part of its system.</w:t>
       </w:r>
     </w:p>
     <w:p>
@@ -126,23 +108,18 @@
         <w:br/>
       </w:r>
       <w:r>
-        <w:t xml:space="preserve">Snapchat gives users some control over their data. Users can access their data, download it, </w:t>
-      </w:r>
-      <w:r>
-        <w:br/>
-        <w:t xml:space="preserve">and request deletion of their account. They can also control privacy settings, such as who </w:t>
-      </w:r>
-      <w:r>
-        <w:br/>
-        <w:t>can view their content and how ads are personalized.</w:t>
-      </w:r>
-      <w:r>
-        <w:br/>
-        <w:t xml:space="preserve">However, some of these settings are not very easy to find, and users may not always know how </w:t>
-      </w:r>
-      <w:r>
-        <w:br/>
-        <w:t>to use them properly.</w:t>
+        <w:t>Snapchat gives users some control over their data. Users can access their data, download it, and request deletion of their account. They can also control privacy settings, such as who can view their content and how ads are personalized.</w:t>
+      </w:r>
+      <w:r>
+        <w:t xml:space="preserve"> </w:t>
+      </w:r>
+      <w:proofErr w:type="gramStart"/>
+      <w:r>
+        <w:t>However</w:t>
+      </w:r>
+      <w:proofErr w:type="gramEnd"/>
+      <w:r>
+        <w:t>, some of these settings are not very easy to find, and users may not always know how to use them properly.</w:t>
       </w:r>
     </w:p>
     <w:p>
@@ -158,15 +135,7 @@
       </w:r>
       <w:r>
         <w:br/>
-        <w:t xml:space="preserve">Users can limit some data collection by changing ad preferences and adjusting </w:t>
-      </w:r>
-      <w:r>
-        <w:lastRenderedPageBreak/>
-        <w:t xml:space="preserve">permissions like </w:t>
-      </w:r>
-      <w:r>
-        <w:br/>
-        <w:t>location access. However, users cannot completely stop all data collection, especially the data needed for the app to function properly.</w:t>
+        <w:t>Users can limit some data collection by changing ad preferences and adjusting permissions like location access. However, users cannot completely stop all data collection, especially the data needed for the app to function properly.</w:t>
       </w:r>
     </w:p>
     <w:p>
@@ -189,34 +158,35 @@
         <w:t>changes and continuing to use the app means they agree to the updated policy.</w:t>
       </w:r>
     </w:p>
-    <w:p/>
     <w:p>
-      <w:r>
+      <w:pPr>
         <w:rPr>
           <w:b/>
           <w:bCs/>
         </w:rPr>
-        <w:t>6. Privacy Risks:</w:t>
-      </w:r>
-      <w:r>
-        <w:br/>
-        <w:t xml:space="preserve">There are some important privacy risks with Snapchat. Even though messages disappear, they can </w:t>
-      </w:r>
-      <w:r>
-        <w:br/>
-        <w:t xml:space="preserve">still be saved or screenshotted, which can be misleading for </w:t>
-      </w:r>
-      <w:r>
-        <w:t>users. Also</w:t>
-      </w:r>
-      <w:r>
-        <w:t>, the collection of behavioral and location data increases the risk of tracking and profiling users.</w:t>
-      </w:r>
+      </w:pPr>
     </w:p>
     <w:p>
       <w:r>
-        <w:br/>
-      </w:r>
+        <w:rPr>
+          <w:b/>
+          <w:bCs/>
+        </w:rPr>
+        <w:lastRenderedPageBreak/>
+        <w:t>6. Privacy Risks:</w:t>
+      </w:r>
+      <w:r>
+        <w:br/>
+        <w:t xml:space="preserve">There are some important privacy risks with Snapchat. Even though messages disappear, they can still be saved or screenshotted, which can be misleading for </w:t>
+      </w:r>
+      <w:r>
+        <w:t>users. Also</w:t>
+      </w:r>
+      <w:r>
+        <w:t>, the collection of behavioral and location data increases the risk of tracking and profiling users.</w:t>
+      </w:r>
+    </w:p>
+    <w:p>
       <w:r>
         <w:rPr>
           <w:b/>
@@ -226,11 +196,7 @@
       </w:r>
       <w:r>
         <w:br/>
-        <w:t xml:space="preserve">Snapchat follows major privacy laws like GDPR and CCPA by providing features such as data </w:t>
-      </w:r>
-      <w:r>
-        <w:br/>
-        <w:t xml:space="preserve">access and deletion. However, because it collects a lot of data and relies heavily on </w:t>
+        <w:t xml:space="preserve">Snapchat follows major privacy laws like GDPR and CCPA by providing features such as data access and deletion. However, because it collects a lot of data and relies heavily on </w:t>
       </w:r>
       <w:r>
         <w:br/>
@@ -1129,6 +1095,7 @@
   <w:style w:type="character" w:default="1" w:styleId="DefaultParagraphFont">
     <w:name w:val="Default Paragraph Font"/>
     <w:uiPriority w:val="1"/>
+    <w:semiHidden/>
     <w:unhideWhenUsed/>
   </w:style>
   <w:style w:type="table" w:default="1" w:styleId="TableNormal">

</xml_diff>